<commit_message>
Use viridis figures and remove duplicate tables
</commit_message>
<xml_diff>
--- a/manuscripts/eplacement_kyc_v4_1_validation/claim_guided_document_evidence_verifier_manuscript.docx
+++ b/manuscripts/eplacement_kyc_v4_1_validation/claim_guided_document_evidence_verifier_manuscript.docx
@@ -389,537 +389,6 @@
       </w:r>
     </w:p>
     <w:p>
-      <w:pPr>
-        <w:spacing w:before="160" w:after="60"/>
-      </w:pPr>
-      <w:r>
-        <w:rPr>
-          <w:b/>
-          <w:i/>
-          <w:sz w:val="18"/>
-        </w:rPr>
-        <w:t>Table 1. Overall validation performance and workload estimates for the claim-guided verifier.</w:t>
-      </w:r>
-    </w:p>
-    <w:tbl>
-      <w:tblPr>
-        <w:tblStyle w:val="TableGrid"/>
-        <w:tblW w:type="auto" w:w="0"/>
-        <w:tblLook w:firstColumn="1" w:firstRow="1" w:lastColumn="0" w:lastRow="0" w:noHBand="0" w:noVBand="1" w:val="04A0"/>
-      </w:tblPr>
-      <w:tblGrid>
-        <w:gridCol w:w="5040"/>
-        <w:gridCol w:w="5040"/>
-      </w:tblGrid>
-      <w:tr>
-        <w:tc>
-          <w:tcPr>
-            <w:tcW w:type="dxa" w:w="5040"/>
-          </w:tcPr>
-          <w:p>
-            <w:r>
-              <w:rPr>
-                <w:b/>
-              </w:rPr>
-              <w:t>Metric</w:t>
-            </w:r>
-          </w:p>
-        </w:tc>
-        <w:tc>
-          <w:tcPr>
-            <w:tcW w:type="dxa" w:w="5040"/>
-          </w:tcPr>
-          <w:p>
-            <w:pPr>
-              <w:jc w:val="right"/>
-            </w:pPr>
-            <w:r>
-              <w:rPr>
-                <w:b/>
-              </w:rPr>
-              <w:t>Result</w:t>
-            </w:r>
-          </w:p>
-        </w:tc>
-      </w:tr>
-      <w:tr>
-        <w:tc>
-          <w:tcPr>
-            <w:tcW w:type="dxa" w:w="5040"/>
-          </w:tcPr>
-          <w:p>
-            <w:r>
-              <w:t>Applicants matched</w:t>
-            </w:r>
-          </w:p>
-        </w:tc>
-        <w:tc>
-          <w:tcPr>
-            <w:tcW w:type="dxa" w:w="5040"/>
-          </w:tcPr>
-          <w:p>
-            <w:pPr>
-              <w:jc w:val="right"/>
-            </w:pPr>
-            <w:r>
-              <w:t>238</w:t>
-            </w:r>
-          </w:p>
-        </w:tc>
-      </w:tr>
-      <w:tr>
-        <w:tc>
-          <w:tcPr>
-            <w:tcW w:type="dxa" w:w="5040"/>
-          </w:tcPr>
-          <w:p>
-            <w:r>
-              <w:t>Evidence-level binary decisions</w:t>
-            </w:r>
-          </w:p>
-        </w:tc>
-        <w:tc>
-          <w:tcPr>
-            <w:tcW w:type="dxa" w:w="5040"/>
-          </w:tcPr>
-          <w:p>
-            <w:pPr>
-              <w:jc w:val="right"/>
-            </w:pPr>
-            <w:r>
-              <w:t>1,428</w:t>
-            </w:r>
-          </w:p>
-        </w:tc>
-      </w:tr>
-      <w:tr>
-        <w:tc>
-          <w:tcPr>
-            <w:tcW w:type="dxa" w:w="5040"/>
-          </w:tcPr>
-          <w:p>
-            <w:r>
-              <w:t>True positives</w:t>
-            </w:r>
-          </w:p>
-        </w:tc>
-        <w:tc>
-          <w:tcPr>
-            <w:tcW w:type="dxa" w:w="5040"/>
-          </w:tcPr>
-          <w:p>
-            <w:pPr>
-              <w:jc w:val="right"/>
-            </w:pPr>
-            <w:r>
-              <w:t>415</w:t>
-            </w:r>
-          </w:p>
-        </w:tc>
-      </w:tr>
-      <w:tr>
-        <w:tc>
-          <w:tcPr>
-            <w:tcW w:type="dxa" w:w="5040"/>
-          </w:tcPr>
-          <w:p>
-            <w:r>
-              <w:t>False positives</w:t>
-            </w:r>
-          </w:p>
-        </w:tc>
-        <w:tc>
-          <w:tcPr>
-            <w:tcW w:type="dxa" w:w="5040"/>
-          </w:tcPr>
-          <w:p>
-            <w:pPr>
-              <w:jc w:val="right"/>
-            </w:pPr>
-            <w:r>
-              <w:t>103</w:t>
-            </w:r>
-          </w:p>
-        </w:tc>
-      </w:tr>
-      <w:tr>
-        <w:tc>
-          <w:tcPr>
-            <w:tcW w:type="dxa" w:w="5040"/>
-          </w:tcPr>
-          <w:p>
-            <w:r>
-              <w:t>True negatives</w:t>
-            </w:r>
-          </w:p>
-        </w:tc>
-        <w:tc>
-          <w:tcPr>
-            <w:tcW w:type="dxa" w:w="5040"/>
-          </w:tcPr>
-          <w:p>
-            <w:pPr>
-              <w:jc w:val="right"/>
-            </w:pPr>
-            <w:r>
-              <w:t>856</w:t>
-            </w:r>
-          </w:p>
-        </w:tc>
-      </w:tr>
-      <w:tr>
-        <w:tc>
-          <w:tcPr>
-            <w:tcW w:type="dxa" w:w="5040"/>
-          </w:tcPr>
-          <w:p>
-            <w:r>
-              <w:t>False negatives</w:t>
-            </w:r>
-          </w:p>
-        </w:tc>
-        <w:tc>
-          <w:tcPr>
-            <w:tcW w:type="dxa" w:w="5040"/>
-          </w:tcPr>
-          <w:p>
-            <w:pPr>
-              <w:jc w:val="right"/>
-            </w:pPr>
-            <w:r>
-              <w:t>54</w:t>
-            </w:r>
-          </w:p>
-        </w:tc>
-      </w:tr>
-      <w:tr>
-        <w:tc>
-          <w:tcPr>
-            <w:tcW w:type="dxa" w:w="5040"/>
-          </w:tcPr>
-          <w:p>
-            <w:r>
-              <w:t>Accuracy</w:t>
-            </w:r>
-          </w:p>
-        </w:tc>
-        <w:tc>
-          <w:tcPr>
-            <w:tcW w:type="dxa" w:w="5040"/>
-          </w:tcPr>
-          <w:p>
-            <w:pPr>
-              <w:jc w:val="right"/>
-            </w:pPr>
-            <w:r>
-              <w:t>89.0%</w:t>
-            </w:r>
-          </w:p>
-        </w:tc>
-      </w:tr>
-      <w:tr>
-        <w:tc>
-          <w:tcPr>
-            <w:tcW w:type="dxa" w:w="5040"/>
-          </w:tcPr>
-          <w:p>
-            <w:r>
-              <w:t>Sensitivity / recall</w:t>
-            </w:r>
-          </w:p>
-        </w:tc>
-        <w:tc>
-          <w:tcPr>
-            <w:tcW w:type="dxa" w:w="5040"/>
-          </w:tcPr>
-          <w:p>
-            <w:pPr>
-              <w:jc w:val="right"/>
-            </w:pPr>
-            <w:r>
-              <w:t>88.5%</w:t>
-            </w:r>
-          </w:p>
-        </w:tc>
-      </w:tr>
-      <w:tr>
-        <w:tc>
-          <w:tcPr>
-            <w:tcW w:type="dxa" w:w="5040"/>
-          </w:tcPr>
-          <w:p>
-            <w:r>
-              <w:t>Specificity</w:t>
-            </w:r>
-          </w:p>
-        </w:tc>
-        <w:tc>
-          <w:tcPr>
-            <w:tcW w:type="dxa" w:w="5040"/>
-          </w:tcPr>
-          <w:p>
-            <w:pPr>
-              <w:jc w:val="right"/>
-            </w:pPr>
-            <w:r>
-              <w:t>89.3%</w:t>
-            </w:r>
-          </w:p>
-        </w:tc>
-      </w:tr>
-      <w:tr>
-        <w:tc>
-          <w:tcPr>
-            <w:tcW w:type="dxa" w:w="5040"/>
-          </w:tcPr>
-          <w:p>
-            <w:r>
-              <w:t>PPV / precision</w:t>
-            </w:r>
-          </w:p>
-        </w:tc>
-        <w:tc>
-          <w:tcPr>
-            <w:tcW w:type="dxa" w:w="5040"/>
-          </w:tcPr>
-          <w:p>
-            <w:pPr>
-              <w:jc w:val="right"/>
-            </w:pPr>
-            <w:r>
-              <w:t>80.1%</w:t>
-            </w:r>
-          </w:p>
-        </w:tc>
-      </w:tr>
-      <w:tr>
-        <w:tc>
-          <w:tcPr>
-            <w:tcW w:type="dxa" w:w="5040"/>
-          </w:tcPr>
-          <w:p>
-            <w:r>
-              <w:t>NPV</w:t>
-            </w:r>
-          </w:p>
-        </w:tc>
-        <w:tc>
-          <w:tcPr>
-            <w:tcW w:type="dxa" w:w="5040"/>
-          </w:tcPr>
-          <w:p>
-            <w:pPr>
-              <w:jc w:val="right"/>
-            </w:pPr>
-            <w:r>
-              <w:t>94.1%</w:t>
-            </w:r>
-          </w:p>
-        </w:tc>
-      </w:tr>
-      <w:tr>
-        <w:tc>
-          <w:tcPr>
-            <w:tcW w:type="dxa" w:w="5040"/>
-          </w:tcPr>
-          <w:p>
-            <w:r>
-              <w:t>F1 score</w:t>
-            </w:r>
-          </w:p>
-        </w:tc>
-        <w:tc>
-          <w:tcPr>
-            <w:tcW w:type="dxa" w:w="5040"/>
-          </w:tcPr>
-          <w:p>
-            <w:pPr>
-              <w:jc w:val="right"/>
-            </w:pPr>
-            <w:r>
-              <w:t>84.1%</w:t>
-            </w:r>
-          </w:p>
-        </w:tc>
-      </w:tr>
-      <w:tr>
-        <w:tc>
-          <w:tcPr>
-            <w:tcW w:type="dxa" w:w="5040"/>
-          </w:tcPr>
-          <w:p>
-            <w:r>
-              <w:t>Exact applicant-level matches</w:t>
-            </w:r>
-          </w:p>
-        </w:tc>
-        <w:tc>
-          <w:tcPr>
-            <w:tcW w:type="dxa" w:w="5040"/>
-          </w:tcPr>
-          <w:p>
-            <w:pPr>
-              <w:jc w:val="right"/>
-            </w:pPr>
-            <w:r>
-              <w:t>118 / 238 (49.6%)</w:t>
-            </w:r>
-          </w:p>
-        </w:tc>
-      </w:tr>
-      <w:tr>
-        <w:tc>
-          <w:tcPr>
-            <w:tcW w:type="dxa" w:w="5040"/>
-          </w:tcPr>
-          <w:p>
-            <w:r>
-              <w:t>Applicants flagged for manual review</w:t>
-            </w:r>
-          </w:p>
-        </w:tc>
-        <w:tc>
-          <w:tcPr>
-            <w:tcW w:type="dxa" w:w="5040"/>
-          </w:tcPr>
-          <w:p>
-            <w:pPr>
-              <w:jc w:val="right"/>
-            </w:pPr>
-            <w:r>
-              <w:t>64 / 238 (26.9%)</w:t>
-            </w:r>
-          </w:p>
-        </w:tc>
-      </w:tr>
-      <w:tr>
-        <w:tc>
-          <w:tcPr>
-            <w:tcW w:type="dxa" w:w="5040"/>
-          </w:tcPr>
-          <w:p>
-            <w:r>
-              <w:t>Applicants not flagged for manual review</w:t>
-            </w:r>
-          </w:p>
-        </w:tc>
-        <w:tc>
-          <w:tcPr>
-            <w:tcW w:type="dxa" w:w="5040"/>
-          </w:tcPr>
-          <w:p>
-            <w:pPr>
-              <w:jc w:val="right"/>
-            </w:pPr>
-            <w:r>
-              <w:t>174 / 238 (73.1%)</w:t>
-            </w:r>
-          </w:p>
-        </w:tc>
-      </w:tr>
-      <w:tr>
-        <w:tc>
-          <w:tcPr>
-            <w:tcW w:type="dxa" w:w="5040"/>
-          </w:tcPr>
-          <w:p>
-            <w:r>
-              <w:t>Approximate machine runtime</w:t>
-            </w:r>
-          </w:p>
-        </w:tc>
-        <w:tc>
-          <w:tcPr>
-            <w:tcW w:type="dxa" w:w="5040"/>
-          </w:tcPr>
-          <w:p>
-            <w:pPr>
-              <w:jc w:val="right"/>
-            </w:pPr>
-            <w:r>
-              <w:t>6 hours</w:t>
-            </w:r>
-          </w:p>
-        </w:tc>
-      </w:tr>
-      <w:tr>
-        <w:tc>
-          <w:tcPr>
-            <w:tcW w:type="dxa" w:w="5040"/>
-          </w:tcPr>
-          <w:p>
-            <w:r>
-              <w:t>Full manual review estimate</w:t>
-            </w:r>
-          </w:p>
-        </w:tc>
-        <w:tc>
-          <w:tcPr>
-            <w:tcW w:type="dxa" w:w="5040"/>
-          </w:tcPr>
-          <w:p>
-            <w:pPr>
-              <w:jc w:val="right"/>
-            </w:pPr>
-            <w:r>
-              <w:t>47.6 person-hours</w:t>
-            </w:r>
-          </w:p>
-        </w:tc>
-      </w:tr>
-      <w:tr>
-        <w:tc>
-          <w:tcPr>
-            <w:tcW w:type="dxa" w:w="5040"/>
-          </w:tcPr>
-          <w:p>
-            <w:r>
-              <w:t>AI-assisted manual review estimate</w:t>
-            </w:r>
-          </w:p>
-        </w:tc>
-        <w:tc>
-          <w:tcPr>
-            <w:tcW w:type="dxa" w:w="5040"/>
-          </w:tcPr>
-          <w:p>
-            <w:pPr>
-              <w:jc w:val="right"/>
-            </w:pPr>
-            <w:r>
-              <w:t>12.8 person-hours</w:t>
-            </w:r>
-          </w:p>
-        </w:tc>
-      </w:tr>
-      <w:tr>
-        <w:tc>
-          <w:tcPr>
-            <w:tcW w:type="dxa" w:w="5040"/>
-          </w:tcPr>
-          <w:p>
-            <w:r>
-              <w:t>Estimated reviewer-hours avoided</w:t>
-            </w:r>
-          </w:p>
-        </w:tc>
-        <w:tc>
-          <w:tcPr>
-            <w:tcW w:type="dxa" w:w="5040"/>
-          </w:tcPr>
-          <w:p>
-            <w:pPr>
-              <w:jc w:val="right"/>
-            </w:pPr>
-            <w:r>
-              <w:t>34.8 person-hours</w:t>
-            </w:r>
-          </w:p>
-        </w:tc>
-      </w:tr>
-    </w:tbl>
-    <w:p/>
-    <w:p>
       <w:r>
         <w:t>These results show that the verifier changed the review workload primarily by reducing the number of evidence bundles requiring immediate manual inspection, while still preserving a targeted check stream.</w:t>
       </w:r>
@@ -931,1379 +400,12 @@
     </w:p>
     <w:p>
       <w:pPr>
-        <w:spacing w:before="160" w:after="60"/>
-      </w:pPr>
-      <w:r>
-        <w:rPr>
-          <w:b/>
-          <w:i/>
-          <w:sz w:val="18"/>
-        </w:rPr>
-        <w:t>Table 2. Evidence-level validation counts by proof category.</w:t>
-      </w:r>
-    </w:p>
-    <w:tbl>
-      <w:tblPr>
-        <w:tblStyle w:val="TableGrid"/>
-        <w:tblW w:type="auto" w:w="0"/>
-        <w:tblLook w:firstColumn="1" w:firstRow="1" w:lastColumn="0" w:lastRow="0" w:noHBand="0" w:noVBand="1" w:val="04A0"/>
-      </w:tblPr>
-      <w:tblGrid>
-        <w:gridCol w:w="1440"/>
-        <w:gridCol w:w="1440"/>
-        <w:gridCol w:w="1440"/>
-        <w:gridCol w:w="1440"/>
-        <w:gridCol w:w="1440"/>
-        <w:gridCol w:w="1440"/>
-        <w:gridCol w:w="1440"/>
-      </w:tblGrid>
-      <w:tr>
-        <w:tc>
-          <w:tcPr>
-            <w:tcW w:type="dxa" w:w="1440"/>
-          </w:tcPr>
-          <w:p>
-            <w:r>
-              <w:rPr>
-                <w:b/>
-              </w:rPr>
-              <w:t>Evidence type</w:t>
-            </w:r>
-          </w:p>
-        </w:tc>
-        <w:tc>
-          <w:tcPr>
-            <w:tcW w:type="dxa" w:w="1440"/>
-          </w:tcPr>
-          <w:p>
-            <w:pPr>
-              <w:jc w:val="right"/>
-            </w:pPr>
-            <w:r>
-              <w:rPr>
-                <w:b/>
-              </w:rPr>
-              <w:t>Manual positives</w:t>
-            </w:r>
-          </w:p>
-        </w:tc>
-        <w:tc>
-          <w:tcPr>
-            <w:tcW w:type="dxa" w:w="1440"/>
-          </w:tcPr>
-          <w:p>
-            <w:pPr>
-              <w:jc w:val="right"/>
-            </w:pPr>
-            <w:r>
-              <w:rPr>
-                <w:b/>
-              </w:rPr>
-              <w:t>AI positives</w:t>
-            </w:r>
-          </w:p>
-        </w:tc>
-        <w:tc>
-          <w:tcPr>
-            <w:tcW w:type="dxa" w:w="1440"/>
-          </w:tcPr>
-          <w:p>
-            <w:pPr>
-              <w:jc w:val="right"/>
-            </w:pPr>
-            <w:r>
-              <w:rPr>
-                <w:b/>
-              </w:rPr>
-              <w:t>TP</w:t>
-            </w:r>
-          </w:p>
-        </w:tc>
-        <w:tc>
-          <w:tcPr>
-            <w:tcW w:type="dxa" w:w="1440"/>
-          </w:tcPr>
-          <w:p>
-            <w:pPr>
-              <w:jc w:val="right"/>
-            </w:pPr>
-            <w:r>
-              <w:rPr>
-                <w:b/>
-              </w:rPr>
-              <w:t>FP</w:t>
-            </w:r>
-          </w:p>
-        </w:tc>
-        <w:tc>
-          <w:tcPr>
-            <w:tcW w:type="dxa" w:w="1440"/>
-          </w:tcPr>
-          <w:p>
-            <w:pPr>
-              <w:jc w:val="right"/>
-            </w:pPr>
-            <w:r>
-              <w:rPr>
-                <w:b/>
-              </w:rPr>
-              <w:t>TN</w:t>
-            </w:r>
-          </w:p>
-        </w:tc>
-        <w:tc>
-          <w:tcPr>
-            <w:tcW w:type="dxa" w:w="1440"/>
-          </w:tcPr>
-          <w:p>
-            <w:pPr>
-              <w:jc w:val="right"/>
-            </w:pPr>
-            <w:r>
-              <w:rPr>
-                <w:b/>
-              </w:rPr>
-              <w:t>FN</w:t>
-            </w:r>
-          </w:p>
-        </w:tc>
-      </w:tr>
-      <w:tr>
-        <w:tc>
-          <w:tcPr>
-            <w:tcW w:type="dxa" w:w="1440"/>
-          </w:tcPr>
-          <w:p>
-            <w:r>
-              <w:t>Marriage</w:t>
-            </w:r>
-          </w:p>
-        </w:tc>
-        <w:tc>
-          <w:tcPr>
-            <w:tcW w:type="dxa" w:w="1440"/>
-          </w:tcPr>
-          <w:p>
-            <w:pPr>
-              <w:jc w:val="right"/>
-            </w:pPr>
-            <w:r>
-              <w:t>143</w:t>
-            </w:r>
-          </w:p>
-        </w:tc>
-        <w:tc>
-          <w:tcPr>
-            <w:tcW w:type="dxa" w:w="1440"/>
-          </w:tcPr>
-          <w:p>
-            <w:pPr>
-              <w:jc w:val="right"/>
-            </w:pPr>
-            <w:r>
-              <w:t>128</w:t>
-            </w:r>
-          </w:p>
-        </w:tc>
-        <w:tc>
-          <w:tcPr>
-            <w:tcW w:type="dxa" w:w="1440"/>
-          </w:tcPr>
-          <w:p>
-            <w:pPr>
-              <w:jc w:val="right"/>
-            </w:pPr>
-            <w:r>
-              <w:t>127</w:t>
-            </w:r>
-          </w:p>
-        </w:tc>
-        <w:tc>
-          <w:tcPr>
-            <w:tcW w:type="dxa" w:w="1440"/>
-          </w:tcPr>
-          <w:p>
-            <w:pPr>
-              <w:jc w:val="right"/>
-            </w:pPr>
-            <w:r>
-              <w:t>1</w:t>
-            </w:r>
-          </w:p>
-        </w:tc>
-        <w:tc>
-          <w:tcPr>
-            <w:tcW w:type="dxa" w:w="1440"/>
-          </w:tcPr>
-          <w:p>
-            <w:pPr>
-              <w:jc w:val="right"/>
-            </w:pPr>
-            <w:r>
-              <w:t>94</w:t>
-            </w:r>
-          </w:p>
-        </w:tc>
-        <w:tc>
-          <w:tcPr>
-            <w:tcW w:type="dxa" w:w="1440"/>
-          </w:tcPr>
-          <w:p>
-            <w:pPr>
-              <w:jc w:val="right"/>
-            </w:pPr>
-            <w:r>
-              <w:t>16</w:t>
-            </w:r>
-          </w:p>
-        </w:tc>
-      </w:tr>
-      <w:tr>
-        <w:tc>
-          <w:tcPr>
-            <w:tcW w:type="dxa" w:w="1440"/>
-          </w:tcPr>
-          <w:p>
-            <w:r>
-              <w:t>Self illness</w:t>
-            </w:r>
-          </w:p>
-        </w:tc>
-        <w:tc>
-          <w:tcPr>
-            <w:tcW w:type="dxa" w:w="1440"/>
-          </w:tcPr>
-          <w:p>
-            <w:pPr>
-              <w:jc w:val="right"/>
-            </w:pPr>
-            <w:r>
-              <w:t>35</w:t>
-            </w:r>
-          </w:p>
-        </w:tc>
-        <w:tc>
-          <w:tcPr>
-            <w:tcW w:type="dxa" w:w="1440"/>
-          </w:tcPr>
-          <w:p>
-            <w:pPr>
-              <w:jc w:val="right"/>
-            </w:pPr>
-            <w:r>
-              <w:t>28</w:t>
-            </w:r>
-          </w:p>
-        </w:tc>
-        <w:tc>
-          <w:tcPr>
-            <w:tcW w:type="dxa" w:w="1440"/>
-          </w:tcPr>
-          <w:p>
-            <w:pPr>
-              <w:jc w:val="right"/>
-            </w:pPr>
-            <w:r>
-              <w:t>24</w:t>
-            </w:r>
-          </w:p>
-        </w:tc>
-        <w:tc>
-          <w:tcPr>
-            <w:tcW w:type="dxa" w:w="1440"/>
-          </w:tcPr>
-          <w:p>
-            <w:pPr>
-              <w:jc w:val="right"/>
-            </w:pPr>
-            <w:r>
-              <w:t>4</w:t>
-            </w:r>
-          </w:p>
-        </w:tc>
-        <w:tc>
-          <w:tcPr>
-            <w:tcW w:type="dxa" w:w="1440"/>
-          </w:tcPr>
-          <w:p>
-            <w:pPr>
-              <w:jc w:val="right"/>
-            </w:pPr>
-            <w:r>
-              <w:t>199</w:t>
-            </w:r>
-          </w:p>
-        </w:tc>
-        <w:tc>
-          <w:tcPr>
-            <w:tcW w:type="dxa" w:w="1440"/>
-          </w:tcPr>
-          <w:p>
-            <w:pPr>
-              <w:jc w:val="right"/>
-            </w:pPr>
-            <w:r>
-              <w:t>11</w:t>
-            </w:r>
-          </w:p>
-        </w:tc>
-      </w:tr>
-      <w:tr>
-        <w:tc>
-          <w:tcPr>
-            <w:tcW w:type="dxa" w:w="1440"/>
-          </w:tcPr>
-          <w:p>
-            <w:r>
-              <w:t>Family illness</w:t>
-            </w:r>
-          </w:p>
-        </w:tc>
-        <w:tc>
-          <w:tcPr>
-            <w:tcW w:type="dxa" w:w="1440"/>
-          </w:tcPr>
-          <w:p>
-            <w:pPr>
-              <w:jc w:val="right"/>
-            </w:pPr>
-            <w:r>
-              <w:t>87</w:t>
-            </w:r>
-          </w:p>
-        </w:tc>
-        <w:tc>
-          <w:tcPr>
-            <w:tcW w:type="dxa" w:w="1440"/>
-          </w:tcPr>
-          <w:p>
-            <w:pPr>
-              <w:jc w:val="right"/>
-            </w:pPr>
-            <w:r>
-              <w:t>119</w:t>
-            </w:r>
-          </w:p>
-        </w:tc>
-        <w:tc>
-          <w:tcPr>
-            <w:tcW w:type="dxa" w:w="1440"/>
-          </w:tcPr>
-          <w:p>
-            <w:pPr>
-              <w:jc w:val="right"/>
-            </w:pPr>
-            <w:r>
-              <w:t>73</w:t>
-            </w:r>
-          </w:p>
-        </w:tc>
-        <w:tc>
-          <w:tcPr>
-            <w:tcW w:type="dxa" w:w="1440"/>
-          </w:tcPr>
-          <w:p>
-            <w:pPr>
-              <w:jc w:val="right"/>
-            </w:pPr>
-            <w:r>
-              <w:t>46</w:t>
-            </w:r>
-          </w:p>
-        </w:tc>
-        <w:tc>
-          <w:tcPr>
-            <w:tcW w:type="dxa" w:w="1440"/>
-          </w:tcPr>
-          <w:p>
-            <w:pPr>
-              <w:jc w:val="right"/>
-            </w:pPr>
-            <w:r>
-              <w:t>105</w:t>
-            </w:r>
-          </w:p>
-        </w:tc>
-        <w:tc>
-          <w:tcPr>
-            <w:tcW w:type="dxa" w:w="1440"/>
-          </w:tcPr>
-          <w:p>
-            <w:pPr>
-              <w:jc w:val="right"/>
-            </w:pPr>
-            <w:r>
-              <w:t>14</w:t>
-            </w:r>
-          </w:p>
-        </w:tc>
-      </w:tr>
-      <w:tr>
-        <w:tc>
-          <w:tcPr>
-            <w:tcW w:type="dxa" w:w="1440"/>
-          </w:tcPr>
-          <w:p>
-            <w:r>
-              <w:t>Spouse location</w:t>
-            </w:r>
-          </w:p>
-        </w:tc>
-        <w:tc>
-          <w:tcPr>
-            <w:tcW w:type="dxa" w:w="1440"/>
-          </w:tcPr>
-          <w:p>
-            <w:pPr>
-              <w:jc w:val="right"/>
-            </w:pPr>
-            <w:r>
-              <w:t>108</w:t>
-            </w:r>
-          </w:p>
-        </w:tc>
-        <w:tc>
-          <w:tcPr>
-            <w:tcW w:type="dxa" w:w="1440"/>
-          </w:tcPr>
-          <w:p>
-            <w:pPr>
-              <w:jc w:val="right"/>
-            </w:pPr>
-            <w:r>
-              <w:t>138</w:t>
-            </w:r>
-          </w:p>
-        </w:tc>
-        <w:tc>
-          <w:tcPr>
-            <w:tcW w:type="dxa" w:w="1440"/>
-          </w:tcPr>
-          <w:p>
-            <w:pPr>
-              <w:jc w:val="right"/>
-            </w:pPr>
-            <w:r>
-              <w:t>106</w:t>
-            </w:r>
-          </w:p>
-        </w:tc>
-        <w:tc>
-          <w:tcPr>
-            <w:tcW w:type="dxa" w:w="1440"/>
-          </w:tcPr>
-          <w:p>
-            <w:pPr>
-              <w:jc w:val="right"/>
-            </w:pPr>
-            <w:r>
-              <w:t>32</w:t>
-            </w:r>
-          </w:p>
-        </w:tc>
-        <w:tc>
-          <w:tcPr>
-            <w:tcW w:type="dxa" w:w="1440"/>
-          </w:tcPr>
-          <w:p>
-            <w:pPr>
-              <w:jc w:val="right"/>
-            </w:pPr>
-            <w:r>
-              <w:t>98</w:t>
-            </w:r>
-          </w:p>
-        </w:tc>
-        <w:tc>
-          <w:tcPr>
-            <w:tcW w:type="dxa" w:w="1440"/>
-          </w:tcPr>
-          <w:p>
-            <w:pPr>
-              <w:jc w:val="right"/>
-            </w:pPr>
-            <w:r>
-              <w:t>2</w:t>
-            </w:r>
-          </w:p>
-        </w:tc>
-      </w:tr>
-      <w:tr>
-        <w:tc>
-          <w:tcPr>
-            <w:tcW w:type="dxa" w:w="1440"/>
-          </w:tcPr>
-          <w:p>
-            <w:r>
-              <w:t>OKU self or family</w:t>
-            </w:r>
-          </w:p>
-        </w:tc>
-        <w:tc>
-          <w:tcPr>
-            <w:tcW w:type="dxa" w:w="1440"/>
-          </w:tcPr>
-          <w:p>
-            <w:pPr>
-              <w:jc w:val="right"/>
-            </w:pPr>
-            <w:r>
-              <w:t>15</w:t>
-            </w:r>
-          </w:p>
-        </w:tc>
-        <w:tc>
-          <w:tcPr>
-            <w:tcW w:type="dxa" w:w="1440"/>
-          </w:tcPr>
-          <w:p>
-            <w:pPr>
-              <w:jc w:val="right"/>
-            </w:pPr>
-            <w:r>
-              <w:t>12</w:t>
-            </w:r>
-          </w:p>
-        </w:tc>
-        <w:tc>
-          <w:tcPr>
-            <w:tcW w:type="dxa" w:w="1440"/>
-          </w:tcPr>
-          <w:p>
-            <w:pPr>
-              <w:jc w:val="right"/>
-            </w:pPr>
-            <w:r>
-              <w:t>11</w:t>
-            </w:r>
-          </w:p>
-        </w:tc>
-        <w:tc>
-          <w:tcPr>
-            <w:tcW w:type="dxa" w:w="1440"/>
-          </w:tcPr>
-          <w:p>
-            <w:pPr>
-              <w:jc w:val="right"/>
-            </w:pPr>
-            <w:r>
-              <w:t>1</w:t>
-            </w:r>
-          </w:p>
-        </w:tc>
-        <w:tc>
-          <w:tcPr>
-            <w:tcW w:type="dxa" w:w="1440"/>
-          </w:tcPr>
-          <w:p>
-            <w:pPr>
-              <w:jc w:val="right"/>
-            </w:pPr>
-            <w:r>
-              <w:t>222</w:t>
-            </w:r>
-          </w:p>
-        </w:tc>
-        <w:tc>
-          <w:tcPr>
-            <w:tcW w:type="dxa" w:w="1440"/>
-          </w:tcPr>
-          <w:p>
-            <w:pPr>
-              <w:jc w:val="right"/>
-            </w:pPr>
-            <w:r>
-              <w:t>4</w:t>
-            </w:r>
-          </w:p>
-        </w:tc>
-      </w:tr>
-      <w:tr>
-        <w:tc>
-          <w:tcPr>
-            <w:tcW w:type="dxa" w:w="1440"/>
-          </w:tcPr>
-          <w:p>
-            <w:r>
-              <w:t>MedEX or other exam</w:t>
-            </w:r>
-          </w:p>
-        </w:tc>
-        <w:tc>
-          <w:tcPr>
-            <w:tcW w:type="dxa" w:w="1440"/>
-          </w:tcPr>
-          <w:p>
-            <w:pPr>
-              <w:jc w:val="right"/>
-            </w:pPr>
-            <w:r>
-              <w:t>81</w:t>
-            </w:r>
-          </w:p>
-        </w:tc>
-        <w:tc>
-          <w:tcPr>
-            <w:tcW w:type="dxa" w:w="1440"/>
-          </w:tcPr>
-          <w:p>
-            <w:pPr>
-              <w:jc w:val="right"/>
-            </w:pPr>
-            <w:r>
-              <w:t>93</w:t>
-            </w:r>
-          </w:p>
-        </w:tc>
-        <w:tc>
-          <w:tcPr>
-            <w:tcW w:type="dxa" w:w="1440"/>
-          </w:tcPr>
-          <w:p>
-            <w:pPr>
-              <w:jc w:val="right"/>
-            </w:pPr>
-            <w:r>
-              <w:t>74</w:t>
-            </w:r>
-          </w:p>
-        </w:tc>
-        <w:tc>
-          <w:tcPr>
-            <w:tcW w:type="dxa" w:w="1440"/>
-          </w:tcPr>
-          <w:p>
-            <w:pPr>
-              <w:jc w:val="right"/>
-            </w:pPr>
-            <w:r>
-              <w:t>19</w:t>
-            </w:r>
-          </w:p>
-        </w:tc>
-        <w:tc>
-          <w:tcPr>
-            <w:tcW w:type="dxa" w:w="1440"/>
-          </w:tcPr>
-          <w:p>
-            <w:pPr>
-              <w:jc w:val="right"/>
-            </w:pPr>
-            <w:r>
-              <w:t>138</w:t>
-            </w:r>
-          </w:p>
-        </w:tc>
-        <w:tc>
-          <w:tcPr>
-            <w:tcW w:type="dxa" w:w="1440"/>
-          </w:tcPr>
-          <w:p>
-            <w:pPr>
-              <w:jc w:val="right"/>
-            </w:pPr>
-            <w:r>
-              <w:t>7</w:t>
-            </w:r>
-          </w:p>
-        </w:tc>
-      </w:tr>
-    </w:tbl>
-    <w:p/>
-    <w:p>
-      <w:r>
-        <w:t>The count-level results show that most residual false-positive burden arose from relational categories, particularly family illness and spouse location.</w:t>
-      </w:r>
-    </w:p>
-    <w:p>
-      <w:pPr>
-        <w:spacing w:before="160" w:after="60"/>
-      </w:pPr>
-      <w:r>
-        <w:rPr>
-          <w:b/>
-          <w:i/>
-          <w:sz w:val="18"/>
-        </w:rPr>
-        <w:t>Table 3. Evidence-level validation performance by proof category.</w:t>
-      </w:r>
-    </w:p>
-    <w:tbl>
-      <w:tblPr>
-        <w:tblStyle w:val="TableGrid"/>
-        <w:tblW w:type="auto" w:w="0"/>
-        <w:tblLook w:firstColumn="1" w:firstRow="1" w:lastColumn="0" w:lastRow="0" w:noHBand="0" w:noVBand="1" w:val="04A0"/>
-      </w:tblPr>
-      <w:tblGrid>
-        <w:gridCol w:w="1440"/>
-        <w:gridCol w:w="1440"/>
-        <w:gridCol w:w="1440"/>
-        <w:gridCol w:w="1440"/>
-        <w:gridCol w:w="1440"/>
-        <w:gridCol w:w="1440"/>
-        <w:gridCol w:w="1440"/>
-      </w:tblGrid>
-      <w:tr>
-        <w:tc>
-          <w:tcPr>
-            <w:tcW w:type="dxa" w:w="1440"/>
-          </w:tcPr>
-          <w:p>
-            <w:r>
-              <w:rPr>
-                <w:b/>
-              </w:rPr>
-              <w:t>Evidence type</w:t>
-            </w:r>
-          </w:p>
-        </w:tc>
-        <w:tc>
-          <w:tcPr>
-            <w:tcW w:type="dxa" w:w="1440"/>
-          </w:tcPr>
-          <w:p>
-            <w:pPr>
-              <w:jc w:val="right"/>
-            </w:pPr>
-            <w:r>
-              <w:rPr>
-                <w:b/>
-              </w:rPr>
-              <w:t>Accuracy</w:t>
-            </w:r>
-          </w:p>
-        </w:tc>
-        <w:tc>
-          <w:tcPr>
-            <w:tcW w:type="dxa" w:w="1440"/>
-          </w:tcPr>
-          <w:p>
-            <w:pPr>
-              <w:jc w:val="right"/>
-            </w:pPr>
-            <w:r>
-              <w:rPr>
-                <w:b/>
-              </w:rPr>
-              <w:t>Sensitivity</w:t>
-            </w:r>
-          </w:p>
-        </w:tc>
-        <w:tc>
-          <w:tcPr>
-            <w:tcW w:type="dxa" w:w="1440"/>
-          </w:tcPr>
-          <w:p>
-            <w:pPr>
-              <w:jc w:val="right"/>
-            </w:pPr>
-            <w:r>
-              <w:rPr>
-                <w:b/>
-              </w:rPr>
-              <w:t>Specificity</w:t>
-            </w:r>
-          </w:p>
-        </w:tc>
-        <w:tc>
-          <w:tcPr>
-            <w:tcW w:type="dxa" w:w="1440"/>
-          </w:tcPr>
-          <w:p>
-            <w:pPr>
-              <w:jc w:val="right"/>
-            </w:pPr>
-            <w:r>
-              <w:rPr>
-                <w:b/>
-              </w:rPr>
-              <w:t>PPV</w:t>
-            </w:r>
-          </w:p>
-        </w:tc>
-        <w:tc>
-          <w:tcPr>
-            <w:tcW w:type="dxa" w:w="1440"/>
-          </w:tcPr>
-          <w:p>
-            <w:pPr>
-              <w:jc w:val="right"/>
-            </w:pPr>
-            <w:r>
-              <w:rPr>
-                <w:b/>
-              </w:rPr>
-              <w:t>NPV</w:t>
-            </w:r>
-          </w:p>
-        </w:tc>
-        <w:tc>
-          <w:tcPr>
-            <w:tcW w:type="dxa" w:w="1440"/>
-          </w:tcPr>
-          <w:p>
-            <w:pPr>
-              <w:jc w:val="right"/>
-            </w:pPr>
-            <w:r>
-              <w:rPr>
-                <w:b/>
-              </w:rPr>
-              <w:t>F1</w:t>
-            </w:r>
-          </w:p>
-        </w:tc>
-      </w:tr>
-      <w:tr>
-        <w:tc>
-          <w:tcPr>
-            <w:tcW w:type="dxa" w:w="1440"/>
-          </w:tcPr>
-          <w:p>
-            <w:r>
-              <w:t>Marriage</w:t>
-            </w:r>
-          </w:p>
-        </w:tc>
-        <w:tc>
-          <w:tcPr>
-            <w:tcW w:type="dxa" w:w="1440"/>
-          </w:tcPr>
-          <w:p>
-            <w:pPr>
-              <w:jc w:val="right"/>
-            </w:pPr>
-            <w:r>
-              <w:t>92.9%</w:t>
-            </w:r>
-          </w:p>
-        </w:tc>
-        <w:tc>
-          <w:tcPr>
-            <w:tcW w:type="dxa" w:w="1440"/>
-          </w:tcPr>
-          <w:p>
-            <w:pPr>
-              <w:jc w:val="right"/>
-            </w:pPr>
-            <w:r>
-              <w:t>88.8%</w:t>
-            </w:r>
-          </w:p>
-        </w:tc>
-        <w:tc>
-          <w:tcPr>
-            <w:tcW w:type="dxa" w:w="1440"/>
-          </w:tcPr>
-          <w:p>
-            <w:pPr>
-              <w:jc w:val="right"/>
-            </w:pPr>
-            <w:r>
-              <w:t>98.9%</w:t>
-            </w:r>
-          </w:p>
-        </w:tc>
-        <w:tc>
-          <w:tcPr>
-            <w:tcW w:type="dxa" w:w="1440"/>
-          </w:tcPr>
-          <w:p>
-            <w:pPr>
-              <w:jc w:val="right"/>
-            </w:pPr>
-            <w:r>
-              <w:t>99.2%</w:t>
-            </w:r>
-          </w:p>
-        </w:tc>
-        <w:tc>
-          <w:tcPr>
-            <w:tcW w:type="dxa" w:w="1440"/>
-          </w:tcPr>
-          <w:p>
-            <w:pPr>
-              <w:jc w:val="right"/>
-            </w:pPr>
-            <w:r>
-              <w:t>85.5%</w:t>
-            </w:r>
-          </w:p>
-        </w:tc>
-        <w:tc>
-          <w:tcPr>
-            <w:tcW w:type="dxa" w:w="1440"/>
-          </w:tcPr>
-          <w:p>
-            <w:pPr>
-              <w:jc w:val="right"/>
-            </w:pPr>
-            <w:r>
-              <w:t>93.7%</w:t>
-            </w:r>
-          </w:p>
-        </w:tc>
-      </w:tr>
-      <w:tr>
-        <w:tc>
-          <w:tcPr>
-            <w:tcW w:type="dxa" w:w="1440"/>
-          </w:tcPr>
-          <w:p>
-            <w:r>
-              <w:t>Self illness</w:t>
-            </w:r>
-          </w:p>
-        </w:tc>
-        <w:tc>
-          <w:tcPr>
-            <w:tcW w:type="dxa" w:w="1440"/>
-          </w:tcPr>
-          <w:p>
-            <w:pPr>
-              <w:jc w:val="right"/>
-            </w:pPr>
-            <w:r>
-              <w:t>93.7%</w:t>
-            </w:r>
-          </w:p>
-        </w:tc>
-        <w:tc>
-          <w:tcPr>
-            <w:tcW w:type="dxa" w:w="1440"/>
-          </w:tcPr>
-          <w:p>
-            <w:pPr>
-              <w:jc w:val="right"/>
-            </w:pPr>
-            <w:r>
-              <w:t>68.6%</w:t>
-            </w:r>
-          </w:p>
-        </w:tc>
-        <w:tc>
-          <w:tcPr>
-            <w:tcW w:type="dxa" w:w="1440"/>
-          </w:tcPr>
-          <w:p>
-            <w:pPr>
-              <w:jc w:val="right"/>
-            </w:pPr>
-            <w:r>
-              <w:t>98.0%</w:t>
-            </w:r>
-          </w:p>
-        </w:tc>
-        <w:tc>
-          <w:tcPr>
-            <w:tcW w:type="dxa" w:w="1440"/>
-          </w:tcPr>
-          <w:p>
-            <w:pPr>
-              <w:jc w:val="right"/>
-            </w:pPr>
-            <w:r>
-              <w:t>85.7%</w:t>
-            </w:r>
-          </w:p>
-        </w:tc>
-        <w:tc>
-          <w:tcPr>
-            <w:tcW w:type="dxa" w:w="1440"/>
-          </w:tcPr>
-          <w:p>
-            <w:pPr>
-              <w:jc w:val="right"/>
-            </w:pPr>
-            <w:r>
-              <w:t>94.8%</w:t>
-            </w:r>
-          </w:p>
-        </w:tc>
-        <w:tc>
-          <w:tcPr>
-            <w:tcW w:type="dxa" w:w="1440"/>
-          </w:tcPr>
-          <w:p>
-            <w:pPr>
-              <w:jc w:val="right"/>
-            </w:pPr>
-            <w:r>
-              <w:t>76.2%</w:t>
-            </w:r>
-          </w:p>
-        </w:tc>
-      </w:tr>
-      <w:tr>
-        <w:tc>
-          <w:tcPr>
-            <w:tcW w:type="dxa" w:w="1440"/>
-          </w:tcPr>
-          <w:p>
-            <w:r>
-              <w:t>Family illness</w:t>
-            </w:r>
-          </w:p>
-        </w:tc>
-        <w:tc>
-          <w:tcPr>
-            <w:tcW w:type="dxa" w:w="1440"/>
-          </w:tcPr>
-          <w:p>
-            <w:pPr>
-              <w:jc w:val="right"/>
-            </w:pPr>
-            <w:r>
-              <w:t>74.8%</w:t>
-            </w:r>
-          </w:p>
-        </w:tc>
-        <w:tc>
-          <w:tcPr>
-            <w:tcW w:type="dxa" w:w="1440"/>
-          </w:tcPr>
-          <w:p>
-            <w:pPr>
-              <w:jc w:val="right"/>
-            </w:pPr>
-            <w:r>
-              <w:t>83.9%</w:t>
-            </w:r>
-          </w:p>
-        </w:tc>
-        <w:tc>
-          <w:tcPr>
-            <w:tcW w:type="dxa" w:w="1440"/>
-          </w:tcPr>
-          <w:p>
-            <w:pPr>
-              <w:jc w:val="right"/>
-            </w:pPr>
-            <w:r>
-              <w:t>69.5%</w:t>
-            </w:r>
-          </w:p>
-        </w:tc>
-        <w:tc>
-          <w:tcPr>
-            <w:tcW w:type="dxa" w:w="1440"/>
-          </w:tcPr>
-          <w:p>
-            <w:pPr>
-              <w:jc w:val="right"/>
-            </w:pPr>
-            <w:r>
-              <w:t>61.3%</w:t>
-            </w:r>
-          </w:p>
-        </w:tc>
-        <w:tc>
-          <w:tcPr>
-            <w:tcW w:type="dxa" w:w="1440"/>
-          </w:tcPr>
-          <w:p>
-            <w:pPr>
-              <w:jc w:val="right"/>
-            </w:pPr>
-            <w:r>
-              <w:t>88.2%</w:t>
-            </w:r>
-          </w:p>
-        </w:tc>
-        <w:tc>
-          <w:tcPr>
-            <w:tcW w:type="dxa" w:w="1440"/>
-          </w:tcPr>
-          <w:p>
-            <w:pPr>
-              <w:jc w:val="right"/>
-            </w:pPr>
-            <w:r>
-              <w:t>70.9%</w:t>
-            </w:r>
-          </w:p>
-        </w:tc>
-      </w:tr>
-      <w:tr>
-        <w:tc>
-          <w:tcPr>
-            <w:tcW w:type="dxa" w:w="1440"/>
-          </w:tcPr>
-          <w:p>
-            <w:r>
-              <w:t>Spouse location</w:t>
-            </w:r>
-          </w:p>
-        </w:tc>
-        <w:tc>
-          <w:tcPr>
-            <w:tcW w:type="dxa" w:w="1440"/>
-          </w:tcPr>
-          <w:p>
-            <w:pPr>
-              <w:jc w:val="right"/>
-            </w:pPr>
-            <w:r>
-              <w:t>85.7%</w:t>
-            </w:r>
-          </w:p>
-        </w:tc>
-        <w:tc>
-          <w:tcPr>
-            <w:tcW w:type="dxa" w:w="1440"/>
-          </w:tcPr>
-          <w:p>
-            <w:pPr>
-              <w:jc w:val="right"/>
-            </w:pPr>
-            <w:r>
-              <w:t>98.1%</w:t>
-            </w:r>
-          </w:p>
-        </w:tc>
-        <w:tc>
-          <w:tcPr>
-            <w:tcW w:type="dxa" w:w="1440"/>
-          </w:tcPr>
-          <w:p>
-            <w:pPr>
-              <w:jc w:val="right"/>
-            </w:pPr>
-            <w:r>
-              <w:t>75.4%</w:t>
-            </w:r>
-          </w:p>
-        </w:tc>
-        <w:tc>
-          <w:tcPr>
-            <w:tcW w:type="dxa" w:w="1440"/>
-          </w:tcPr>
-          <w:p>
-            <w:pPr>
-              <w:jc w:val="right"/>
-            </w:pPr>
-            <w:r>
-              <w:t>76.8%</w:t>
-            </w:r>
-          </w:p>
-        </w:tc>
-        <w:tc>
-          <w:tcPr>
-            <w:tcW w:type="dxa" w:w="1440"/>
-          </w:tcPr>
-          <w:p>
-            <w:pPr>
-              <w:jc w:val="right"/>
-            </w:pPr>
-            <w:r>
-              <w:t>98.0%</w:t>
-            </w:r>
-          </w:p>
-        </w:tc>
-        <w:tc>
-          <w:tcPr>
-            <w:tcW w:type="dxa" w:w="1440"/>
-          </w:tcPr>
-          <w:p>
-            <w:pPr>
-              <w:jc w:val="right"/>
-            </w:pPr>
-            <w:r>
-              <w:t>86.2%</w:t>
-            </w:r>
-          </w:p>
-        </w:tc>
-      </w:tr>
-      <w:tr>
-        <w:tc>
-          <w:tcPr>
-            <w:tcW w:type="dxa" w:w="1440"/>
-          </w:tcPr>
-          <w:p>
-            <w:r>
-              <w:t>OKU self or family</w:t>
-            </w:r>
-          </w:p>
-        </w:tc>
-        <w:tc>
-          <w:tcPr>
-            <w:tcW w:type="dxa" w:w="1440"/>
-          </w:tcPr>
-          <w:p>
-            <w:pPr>
-              <w:jc w:val="right"/>
-            </w:pPr>
-            <w:r>
-              <w:t>97.9%</w:t>
-            </w:r>
-          </w:p>
-        </w:tc>
-        <w:tc>
-          <w:tcPr>
-            <w:tcW w:type="dxa" w:w="1440"/>
-          </w:tcPr>
-          <w:p>
-            <w:pPr>
-              <w:jc w:val="right"/>
-            </w:pPr>
-            <w:r>
-              <w:t>73.3%</w:t>
-            </w:r>
-          </w:p>
-        </w:tc>
-        <w:tc>
-          <w:tcPr>
-            <w:tcW w:type="dxa" w:w="1440"/>
-          </w:tcPr>
-          <w:p>
-            <w:pPr>
-              <w:jc w:val="right"/>
-            </w:pPr>
-            <w:r>
-              <w:t>99.6%</w:t>
-            </w:r>
-          </w:p>
-        </w:tc>
-        <w:tc>
-          <w:tcPr>
-            <w:tcW w:type="dxa" w:w="1440"/>
-          </w:tcPr>
-          <w:p>
-            <w:pPr>
-              <w:jc w:val="right"/>
-            </w:pPr>
-            <w:r>
-              <w:t>91.7%</w:t>
-            </w:r>
-          </w:p>
-        </w:tc>
-        <w:tc>
-          <w:tcPr>
-            <w:tcW w:type="dxa" w:w="1440"/>
-          </w:tcPr>
-          <w:p>
-            <w:pPr>
-              <w:jc w:val="right"/>
-            </w:pPr>
-            <w:r>
-              <w:t>98.2%</w:t>
-            </w:r>
-          </w:p>
-        </w:tc>
-        <w:tc>
-          <w:tcPr>
-            <w:tcW w:type="dxa" w:w="1440"/>
-          </w:tcPr>
-          <w:p>
-            <w:pPr>
-              <w:jc w:val="right"/>
-            </w:pPr>
-            <w:r>
-              <w:t>81.5%</w:t>
-            </w:r>
-          </w:p>
-        </w:tc>
-      </w:tr>
-      <w:tr>
-        <w:tc>
-          <w:tcPr>
-            <w:tcW w:type="dxa" w:w="1440"/>
-          </w:tcPr>
-          <w:p>
-            <w:r>
-              <w:t>MedEX or other exam</w:t>
-            </w:r>
-          </w:p>
-        </w:tc>
-        <w:tc>
-          <w:tcPr>
-            <w:tcW w:type="dxa" w:w="1440"/>
-          </w:tcPr>
-          <w:p>
-            <w:pPr>
-              <w:jc w:val="right"/>
-            </w:pPr>
-            <w:r>
-              <w:t>89.1%</w:t>
-            </w:r>
-          </w:p>
-        </w:tc>
-        <w:tc>
-          <w:tcPr>
-            <w:tcW w:type="dxa" w:w="1440"/>
-          </w:tcPr>
-          <w:p>
-            <w:pPr>
-              <w:jc w:val="right"/>
-            </w:pPr>
-            <w:r>
-              <w:t>91.4%</w:t>
-            </w:r>
-          </w:p>
-        </w:tc>
-        <w:tc>
-          <w:tcPr>
-            <w:tcW w:type="dxa" w:w="1440"/>
-          </w:tcPr>
-          <w:p>
-            <w:pPr>
-              <w:jc w:val="right"/>
-            </w:pPr>
-            <w:r>
-              <w:t>87.9%</w:t>
-            </w:r>
-          </w:p>
-        </w:tc>
-        <w:tc>
-          <w:tcPr>
-            <w:tcW w:type="dxa" w:w="1440"/>
-          </w:tcPr>
-          <w:p>
-            <w:pPr>
-              <w:jc w:val="right"/>
-            </w:pPr>
-            <w:r>
-              <w:t>79.6%</w:t>
-            </w:r>
-          </w:p>
-        </w:tc>
-        <w:tc>
-          <w:tcPr>
-            <w:tcW w:type="dxa" w:w="1440"/>
-          </w:tcPr>
-          <w:p>
-            <w:pPr>
-              <w:jc w:val="right"/>
-            </w:pPr>
-            <w:r>
-              <w:t>95.2%</w:t>
-            </w:r>
-          </w:p>
-        </w:tc>
-        <w:tc>
-          <w:tcPr>
-            <w:tcW w:type="dxa" w:w="1440"/>
-          </w:tcPr>
-          <w:p>
-            <w:pPr>
-              <w:jc w:val="right"/>
-            </w:pPr>
-            <w:r>
-              <w:t>85.1%</w:t>
-            </w:r>
-          </w:p>
-        </w:tc>
-      </w:tr>
-    </w:tbl>
-    <w:p/>
-    <w:p>
-      <w:pPr>
         <w:jc w:val="center"/>
       </w:pPr>
       <w:r>
         <w:drawing>
           <wp:inline xmlns:a="http://schemas.openxmlformats.org/drawingml/2006/main" xmlns:pic="http://schemas.openxmlformats.org/drawingml/2006/picture">
-            <wp:extent cx="6217920" cy="3919993"/>
+            <wp:extent cx="6217920" cy="3514477"/>
             <wp:docPr id="5" name="Picture 5"/>
             <wp:cNvGraphicFramePr>
               <a:graphicFrameLocks noChangeAspect="1"/>
@@ -2324,7 +426,7 @@
                   <pic:spPr>
                     <a:xfrm>
                       <a:off x="0" y="0"/>
-                      <a:ext cx="6217920" cy="3919993"/>
+                      <a:ext cx="6217920" cy="3514477"/>
                     </a:xfrm>
                     <a:prstGeom prst="rect"/>
                   </pic:spPr>
@@ -2349,405 +451,14 @@
     </w:p>
     <w:p>
       <w:r>
+        <w:t>The figure shows the main evidence-type trade-off directly: highly specific categories such as marriage and OKU proof behaved differently from relational categories, where sensitivity was high but specificity was lower.</w:t>
+      </w:r>
+    </w:p>
+    <w:p>
+      <w:r>
         <w:t>The manual review flag created a smaller operational review queue, but it did not identify every residual error. Among applicants with at least one evidence-level error, 34 of 120 were flagged for review. Among applicants with at least one false negative, 25 of 48 were flagged. This distinction matters: check_required is a workflow-control signal, not a guarantee that all no-check records are error-free.</w:t>
       </w:r>
     </w:p>
-    <w:p>
-      <w:pPr>
-        <w:spacing w:before="160" w:after="60"/>
-      </w:pPr>
-      <w:r>
-        <w:rPr>
-          <w:b/>
-          <w:i/>
-          <w:sz w:val="18"/>
-        </w:rPr>
-        <w:t>Table 4. Manual-review flag behaviour among evidence-level errors and applicant-level error groups.</w:t>
-      </w:r>
-    </w:p>
-    <w:tbl>
-      <w:tblPr>
-        <w:tblStyle w:val="TableGrid"/>
-        <w:tblW w:type="auto" w:w="0"/>
-        <w:tblLook w:firstColumn="1" w:firstRow="1" w:lastColumn="0" w:lastRow="0" w:noHBand="0" w:noVBand="1" w:val="04A0"/>
-      </w:tblPr>
-      <w:tblGrid>
-        <w:gridCol w:w="2520"/>
-        <w:gridCol w:w="2520"/>
-        <w:gridCol w:w="2520"/>
-        <w:gridCol w:w="2520"/>
-      </w:tblGrid>
-      <w:tr>
-        <w:tc>
-          <w:tcPr>
-            <w:tcW w:type="dxa" w:w="2520"/>
-          </w:tcPr>
-          <w:p>
-            <w:r>
-              <w:rPr>
-                <w:b/>
-              </w:rPr>
-              <w:t>Error or review group</w:t>
-            </w:r>
-          </w:p>
-        </w:tc>
-        <w:tc>
-          <w:tcPr>
-            <w:tcW w:type="dxa" w:w="2520"/>
-          </w:tcPr>
-          <w:p>
-            <w:pPr>
-              <w:jc w:val="right"/>
-            </w:pPr>
-            <w:r>
-              <w:rPr>
-                <w:b/>
-              </w:rPr>
-              <w:t>Total</w:t>
-            </w:r>
-          </w:p>
-        </w:tc>
-        <w:tc>
-          <w:tcPr>
-            <w:tcW w:type="dxa" w:w="2520"/>
-          </w:tcPr>
-          <w:p>
-            <w:pPr>
-              <w:jc w:val="right"/>
-            </w:pPr>
-            <w:r>
-              <w:rPr>
-                <w:b/>
-              </w:rPr>
-              <w:t>Flagged for review</w:t>
-            </w:r>
-          </w:p>
-        </w:tc>
-        <w:tc>
-          <w:tcPr>
-            <w:tcW w:type="dxa" w:w="2520"/>
-          </w:tcPr>
-          <w:p>
-            <w:pPr>
-              <w:jc w:val="right"/>
-            </w:pPr>
-            <w:r>
-              <w:rPr>
-                <w:b/>
-              </w:rPr>
-              <w:t>Percentage flagged</w:t>
-            </w:r>
-          </w:p>
-        </w:tc>
-      </w:tr>
-      <w:tr>
-        <w:tc>
-          <w:tcPr>
-            <w:tcW w:type="dxa" w:w="2520"/>
-          </w:tcPr>
-          <w:p>
-            <w:r>
-              <w:t>False-positive evidence decisions</w:t>
-            </w:r>
-          </w:p>
-        </w:tc>
-        <w:tc>
-          <w:tcPr>
-            <w:tcW w:type="dxa" w:w="2520"/>
-          </w:tcPr>
-          <w:p>
-            <w:pPr>
-              <w:jc w:val="right"/>
-            </w:pPr>
-            <w:r>
-              <w:t>103</w:t>
-            </w:r>
-          </w:p>
-        </w:tc>
-        <w:tc>
-          <w:tcPr>
-            <w:tcW w:type="dxa" w:w="2520"/>
-          </w:tcPr>
-          <w:p>
-            <w:pPr>
-              <w:jc w:val="right"/>
-            </w:pPr>
-            <w:r>
-              <w:t>19</w:t>
-            </w:r>
-          </w:p>
-        </w:tc>
-        <w:tc>
-          <w:tcPr>
-            <w:tcW w:type="dxa" w:w="2520"/>
-          </w:tcPr>
-          <w:p>
-            <w:pPr>
-              <w:jc w:val="right"/>
-            </w:pPr>
-            <w:r>
-              <w:t>18.4%</w:t>
-            </w:r>
-          </w:p>
-        </w:tc>
-      </w:tr>
-      <w:tr>
-        <w:tc>
-          <w:tcPr>
-            <w:tcW w:type="dxa" w:w="2520"/>
-          </w:tcPr>
-          <w:p>
-            <w:r>
-              <w:t>False-negative evidence decisions</w:t>
-            </w:r>
-          </w:p>
-        </w:tc>
-        <w:tc>
-          <w:tcPr>
-            <w:tcW w:type="dxa" w:w="2520"/>
-          </w:tcPr>
-          <w:p>
-            <w:pPr>
-              <w:jc w:val="right"/>
-            </w:pPr>
-            <w:r>
-              <w:t>54</w:t>
-            </w:r>
-          </w:p>
-        </w:tc>
-        <w:tc>
-          <w:tcPr>
-            <w:tcW w:type="dxa" w:w="2520"/>
-          </w:tcPr>
-          <w:p>
-            <w:pPr>
-              <w:jc w:val="right"/>
-            </w:pPr>
-            <w:r>
-              <w:t>29</w:t>
-            </w:r>
-          </w:p>
-        </w:tc>
-        <w:tc>
-          <w:tcPr>
-            <w:tcW w:type="dxa" w:w="2520"/>
-          </w:tcPr>
-          <w:p>
-            <w:pPr>
-              <w:jc w:val="right"/>
-            </w:pPr>
-            <w:r>
-              <w:t>53.7%</w:t>
-            </w:r>
-          </w:p>
-        </w:tc>
-      </w:tr>
-      <w:tr>
-        <w:tc>
-          <w:tcPr>
-            <w:tcW w:type="dxa" w:w="2520"/>
-          </w:tcPr>
-          <w:p>
-            <w:r>
-              <w:t>Applicants with at least one false positive</w:t>
-            </w:r>
-          </w:p>
-        </w:tc>
-        <w:tc>
-          <w:tcPr>
-            <w:tcW w:type="dxa" w:w="2520"/>
-          </w:tcPr>
-          <w:p>
-            <w:pPr>
-              <w:jc w:val="right"/>
-            </w:pPr>
-            <w:r>
-              <w:t>92</w:t>
-            </w:r>
-          </w:p>
-        </w:tc>
-        <w:tc>
-          <w:tcPr>
-            <w:tcW w:type="dxa" w:w="2520"/>
-          </w:tcPr>
-          <w:p>
-            <w:pPr>
-              <w:jc w:val="right"/>
-            </w:pPr>
-            <w:r>
-              <w:t>18</w:t>
-            </w:r>
-          </w:p>
-        </w:tc>
-        <w:tc>
-          <w:tcPr>
-            <w:tcW w:type="dxa" w:w="2520"/>
-          </w:tcPr>
-          <w:p>
-            <w:pPr>
-              <w:jc w:val="right"/>
-            </w:pPr>
-            <w:r>
-              <w:t>19.6%</w:t>
-            </w:r>
-          </w:p>
-        </w:tc>
-      </w:tr>
-      <w:tr>
-        <w:tc>
-          <w:tcPr>
-            <w:tcW w:type="dxa" w:w="2520"/>
-          </w:tcPr>
-          <w:p>
-            <w:r>
-              <w:t>Applicants with at least one false negative</w:t>
-            </w:r>
-          </w:p>
-        </w:tc>
-        <w:tc>
-          <w:tcPr>
-            <w:tcW w:type="dxa" w:w="2520"/>
-          </w:tcPr>
-          <w:p>
-            <w:pPr>
-              <w:jc w:val="right"/>
-            </w:pPr>
-            <w:r>
-              <w:t>48</w:t>
-            </w:r>
-          </w:p>
-        </w:tc>
-        <w:tc>
-          <w:tcPr>
-            <w:tcW w:type="dxa" w:w="2520"/>
-          </w:tcPr>
-          <w:p>
-            <w:pPr>
-              <w:jc w:val="right"/>
-            </w:pPr>
-            <w:r>
-              <w:t>25</w:t>
-            </w:r>
-          </w:p>
-        </w:tc>
-        <w:tc>
-          <w:tcPr>
-            <w:tcW w:type="dxa" w:w="2520"/>
-          </w:tcPr>
-          <w:p>
-            <w:pPr>
-              <w:jc w:val="right"/>
-            </w:pPr>
-            <w:r>
-              <w:t>52.1%</w:t>
-            </w:r>
-          </w:p>
-        </w:tc>
-      </w:tr>
-      <w:tr>
-        <w:tc>
-          <w:tcPr>
-            <w:tcW w:type="dxa" w:w="2520"/>
-          </w:tcPr>
-          <w:p>
-            <w:r>
-              <w:t>Applicants with any evidence-level error</w:t>
-            </w:r>
-          </w:p>
-        </w:tc>
-        <w:tc>
-          <w:tcPr>
-            <w:tcW w:type="dxa" w:w="2520"/>
-          </w:tcPr>
-          <w:p>
-            <w:pPr>
-              <w:jc w:val="right"/>
-            </w:pPr>
-            <w:r>
-              <w:t>120</w:t>
-            </w:r>
-          </w:p>
-        </w:tc>
-        <w:tc>
-          <w:tcPr>
-            <w:tcW w:type="dxa" w:w="2520"/>
-          </w:tcPr>
-          <w:p>
-            <w:pPr>
-              <w:jc w:val="right"/>
-            </w:pPr>
-            <w:r>
-              <w:t>34</w:t>
-            </w:r>
-          </w:p>
-        </w:tc>
-        <w:tc>
-          <w:tcPr>
-            <w:tcW w:type="dxa" w:w="2520"/>
-          </w:tcPr>
-          <w:p>
-            <w:pPr>
-              <w:jc w:val="right"/>
-            </w:pPr>
-            <w:r>
-              <w:t>28.3%</w:t>
-            </w:r>
-          </w:p>
-        </w:tc>
-      </w:tr>
-      <w:tr>
-        <w:tc>
-          <w:tcPr>
-            <w:tcW w:type="dxa" w:w="2520"/>
-          </w:tcPr>
-          <w:p>
-            <w:r>
-              <w:t>All applicants</w:t>
-            </w:r>
-          </w:p>
-        </w:tc>
-        <w:tc>
-          <w:tcPr>
-            <w:tcW w:type="dxa" w:w="2520"/>
-          </w:tcPr>
-          <w:p>
-            <w:pPr>
-              <w:jc w:val="right"/>
-            </w:pPr>
-            <w:r>
-              <w:t>238</w:t>
-            </w:r>
-          </w:p>
-        </w:tc>
-        <w:tc>
-          <w:tcPr>
-            <w:tcW w:type="dxa" w:w="2520"/>
-          </w:tcPr>
-          <w:p>
-            <w:pPr>
-              <w:jc w:val="right"/>
-            </w:pPr>
-            <w:r>
-              <w:t>64</w:t>
-            </w:r>
-          </w:p>
-        </w:tc>
-        <w:tc>
-          <w:tcPr>
-            <w:tcW w:type="dxa" w:w="2520"/>
-          </w:tcPr>
-          <w:p>
-            <w:pPr>
-              <w:jc w:val="right"/>
-            </w:pPr>
-            <w:r>
-              <w:t>26.9%</w:t>
-            </w:r>
-          </w:p>
-        </w:tc>
-      </w:tr>
-    </w:tbl>
-    <w:p/>
     <w:p>
       <w:r>
         <w:t>The operational interpretation is therefore two-sided: the system reduced immediate reviewer workload, but the no-check stream still requires monitoring, sampling and periodic recalibration.</w:t>
@@ -2760,7 +471,7 @@
       <w:r>
         <w:drawing>
           <wp:inline xmlns:a="http://schemas.openxmlformats.org/drawingml/2006/main" xmlns:pic="http://schemas.openxmlformats.org/drawingml/2006/picture">
-            <wp:extent cx="6217920" cy="3815542"/>
+            <wp:extent cx="6217920" cy="3391593"/>
             <wp:docPr id="6" name="Picture 6"/>
             <wp:cNvGraphicFramePr>
               <a:graphicFrameLocks noChangeAspect="1"/>
@@ -2781,7 +492,7 @@
                   <pic:spPr>
                     <a:xfrm>
                       <a:off x="0" y="0"/>
-                      <a:ext cx="6217920" cy="3815542"/>
+                      <a:ext cx="6217920" cy="3391593"/>
                     </a:xfrm>
                     <a:prstGeom prst="rect"/>
                   </pic:spPr>

</xml_diff>